<commit_message>
Update KYRGA manual with real KYRGA ASMS screenshots (test data)
Replaces the reused OCTANE screenshots with fresh captures from the KYRGA
ASMS interface (blue palette) using the demonstration data, in Portuguese.
Adds figures for the Company (palette), Audit Log and Import Simulator sections.

Co-Authored-By: Claude Opus 4.8 <noreply@anthropic.com>
Claude-Session: https://claude.ai/code/session_01RH98an53K9ERaUdwiwhfJV
</commit_message>
<xml_diff>
--- a/Manual_KYRGA_ASMS_Ilustrado.docx
+++ b/Manual_KYRGA_ASMS_Ilustrado.docx
@@ -620,7 +620,7 @@
       <w:r>
         <w:drawing>
           <wp:inline xmlns:a="http://schemas.openxmlformats.org/drawingml/2006/main" xmlns:pic="http://schemas.openxmlformats.org/drawingml/2006/picture">
-            <wp:extent cx="5486400" cy="3857625"/>
+            <wp:extent cx="5577840" cy="3486150"/>
             <wp:docPr id="2" name="Picture 2"/>
             <wp:cNvGraphicFramePr>
               <a:graphicFrameLocks noChangeAspect="1"/>
@@ -629,7 +629,7 @@
               <a:graphicData uri="http://schemas.openxmlformats.org/drawingml/2006/picture">
                 <pic:pic>
                   <pic:nvPicPr>
-                    <pic:cNvPr id="0" name="image1.png"/>
+                    <pic:cNvPr id="0" name="login.png"/>
                     <pic:cNvPicPr/>
                   </pic:nvPicPr>
                   <pic:blipFill>
@@ -641,7 +641,7 @@
                   <pic:spPr>
                     <a:xfrm>
                       <a:off x="0" y="0"/>
-                      <a:ext cx="5486400" cy="3857625"/>
+                      <a:ext cx="5577840" cy="3486150"/>
                     </a:xfrm>
                     <a:prstGeom prst="rect"/>
                   </pic:spPr>
@@ -862,7 +862,7 @@
       <w:r>
         <w:drawing>
           <wp:inline xmlns:a="http://schemas.openxmlformats.org/drawingml/2006/main" xmlns:pic="http://schemas.openxmlformats.org/drawingml/2006/picture">
-            <wp:extent cx="5486400" cy="3857625"/>
+            <wp:extent cx="5577840" cy="3854132"/>
             <wp:docPr id="3" name="Picture 3"/>
             <wp:cNvGraphicFramePr>
               <a:graphicFrameLocks noChangeAspect="1"/>
@@ -871,7 +871,7 @@
               <a:graphicData uri="http://schemas.openxmlformats.org/drawingml/2006/picture">
                 <pic:pic>
                   <pic:nvPicPr>
-                    <pic:cNvPr id="0" name="image2.png"/>
+                    <pic:cNvPr id="0" name="dashboard.png"/>
                     <pic:cNvPicPr/>
                   </pic:nvPicPr>
                   <pic:blipFill>
@@ -883,7 +883,7 @@
                   <pic:spPr>
                     <a:xfrm>
                       <a:off x="0" y="0"/>
-                      <a:ext cx="5486400" cy="3857625"/>
+                      <a:ext cx="5577840" cy="3854132"/>
                     </a:xfrm>
                     <a:prstGeom prst="rect"/>
                   </pic:spPr>
@@ -986,7 +986,7 @@
           <w:i w:val="0"/>
           <w:sz w:val="22"/>
         </w:rPr>
-        <w:t>Existe um botão que permite ligar e desligar a contagem das viaturas financiadas por investidores na margem e no gráfico. Assim, essas viaturas não influenciam a margem quando têm um investidor associado.</w:t>
+        <w:t>O botão «Excluir Investidores» permite ligar e desligar a contagem das viaturas financiadas por investidores na margem e no gráfico. Assim, essas viaturas não influenciam a margem quando têm um investidor associado.</w:t>
       </w:r>
     </w:p>
     <w:p>
@@ -1020,12 +1020,85 @@
     </w:p>
     <w:p>
       <w:pPr>
+        <w:pStyle w:val="Heading2"/>
+        <w:spacing w:before="200" w:after="80"/>
+      </w:pPr>
+      <w:r>
+        <w:rPr>
+          <w:rFonts w:ascii="Aptos" w:hAnsi="Aptos" w:eastAsia="Aptos"/>
+          <w:b/>
+          <w:color w:val="2348E8"/>
+          <w:sz w:val="26"/>
+        </w:rPr>
+        <w:t>Gráfico de Evolução</w:t>
+      </w:r>
+    </w:p>
+    <w:p>
+      <w:pPr>
+        <w:spacing w:after="120"/>
+      </w:pPr>
+      <w:r>
+        <w:rPr>
+          <w:rFonts w:ascii="Aptos" w:hAnsi="Aptos" w:eastAsia="Aptos"/>
+          <w:b w:val="0"/>
+          <w:i w:val="0"/>
+          <w:sz w:val="22"/>
+        </w:rPr>
+        <w:t>Mostra a evolução ao longo do tempo: barras para as viaturas em stock, barras para as vendidas e uma linha com a margem acumulada.</w:t>
+      </w:r>
+    </w:p>
+    <w:p>
+      <w:pPr>
+        <w:pStyle w:val="Heading1"/>
+        <w:spacing w:before="280" w:after="120"/>
+      </w:pPr>
+      <w:r>
+        <w:rPr>
+          <w:rFonts w:ascii="Aptos" w:hAnsi="Aptos" w:eastAsia="Aptos"/>
+          <w:b/>
+          <w:color w:val="2348E8"/>
+          <w:sz w:val="34"/>
+        </w:rPr>
+        <w:t>6. Gestão de Viaturas</w:t>
+      </w:r>
+    </w:p>
+    <w:p>
+      <w:pPr>
+        <w:pStyle w:val="Heading2"/>
+        <w:spacing w:before="200" w:after="80"/>
+      </w:pPr>
+      <w:r>
+        <w:rPr>
+          <w:rFonts w:ascii="Aptos" w:hAnsi="Aptos" w:eastAsia="Aptos"/>
+          <w:b/>
+          <w:color w:val="2348E8"/>
+          <w:sz w:val="26"/>
+        </w:rPr>
+        <w:t>Ver viaturas</w:t>
+      </w:r>
+    </w:p>
+    <w:p>
+      <w:pPr>
+        <w:spacing w:after="120"/>
+      </w:pPr>
+      <w:r>
+        <w:rPr>
+          <w:rFonts w:ascii="Aptos" w:hAnsi="Aptos" w:eastAsia="Aptos"/>
+          <w:b w:val="0"/>
+          <w:i w:val="0"/>
+          <w:sz w:val="22"/>
+        </w:rPr>
+        <w:t>No menu «Viaturas» encontra a lista de todas as viaturas a que tem acesso, organizada em dois separadores: «Stock» e «Viaturas de Investidores». Pode filtrar por estado no canto superior direito.</w:t>
+      </w:r>
+    </w:p>
+    <w:p>
+      <w:pPr>
         <w:jc w:val="center"/>
       </w:pPr>
       <w:r>
         <w:drawing>
           <wp:inline xmlns:a="http://schemas.openxmlformats.org/drawingml/2006/main" xmlns:pic="http://schemas.openxmlformats.org/drawingml/2006/picture">
-            <wp:extent cx="5486400" cy="3857625"/>
+            <wp:extent cx="5577840" cy="3486150"/>
             <wp:docPr id="4" name="Picture 4"/>
             <wp:cNvGraphicFramePr>
               <a:graphicFrameLocks noChangeAspect="1"/>
@@ -1034,7 +1107,7 @@
               <a:graphicData uri="http://schemas.openxmlformats.org/drawingml/2006/picture">
                 <pic:pic>
                   <pic:nvPicPr>
-                    <pic:cNvPr id="0" name="image3.png"/>
+                    <pic:cNvPr id="0" name="vehicles.png"/>
                     <pic:cNvPicPr/>
                   </pic:nvPicPr>
                   <pic:blipFill>
@@ -1046,7 +1119,7 @@
                   <pic:spPr>
                     <a:xfrm>
                       <a:off x="0" y="0"/>
-                      <a:ext cx="5486400" cy="3857625"/>
+                      <a:ext cx="5577840" cy="3486150"/>
                     </a:xfrm>
                     <a:prstGeom prst="rect"/>
                   </pic:spPr>
@@ -1069,7 +1142,7 @@
           <w:color w:val="555555"/>
           <w:sz w:val="18"/>
         </w:rPr>
-        <w:t>Figura 3: Detalhe da composição da Margem Bruta.</w:t>
+        <w:t>Figura 3: Lista de viaturas.</w:t>
       </w:r>
     </w:p>
     <w:p>
@@ -1084,75 +1157,89 @@
           <w:color w:val="2348E8"/>
           <w:sz w:val="26"/>
         </w:rPr>
-        <w:t>Gráfico de Evolução</w:t>
+        <w:t>Registar uma nova viatura</w:t>
       </w:r>
     </w:p>
     <w:p>
       <w:pPr>
-        <w:spacing w:after="120"/>
+        <w:pStyle w:val="ListNumber"/>
       </w:pPr>
       <w:r>
         <w:rPr>
           <w:rFonts w:ascii="Aptos" w:hAnsi="Aptos" w:eastAsia="Aptos"/>
-          <w:b w:val="0"/>
-          <w:i w:val="0"/>
           <w:sz w:val="22"/>
         </w:rPr>
-        <w:t>Mostra a evolução ao longo do tempo: barras para as viaturas em stock, barras para as vendidas e uma linha com a margem acumulada.</w:t>
+        <w:t>Clique no botão «+ Nova Viatura».</w:t>
       </w:r>
     </w:p>
     <w:p>
       <w:pPr>
-        <w:pStyle w:val="Heading1"/>
-        <w:spacing w:before="280" w:after="120"/>
+        <w:pStyle w:val="ListNumber"/>
       </w:pPr>
       <w:r>
         <w:rPr>
           <w:rFonts w:ascii="Aptos" w:hAnsi="Aptos" w:eastAsia="Aptos"/>
-          <w:b/>
-          <w:color w:val="2348E8"/>
-          <w:sz w:val="34"/>
+          <w:sz w:val="22"/>
         </w:rPr>
-        <w:t>6. Gestão de Viaturas</w:t>
+        <w:t>Preencha primeiro a Data (pode usar o botão «Hoje»).</w:t>
       </w:r>
     </w:p>
     <w:p>
       <w:pPr>
-        <w:pStyle w:val="Heading2"/>
-        <w:spacing w:before="200" w:after="80"/>
+        <w:pStyle w:val="ListNumber"/>
       </w:pPr>
       <w:r>
         <w:rPr>
           <w:rFonts w:ascii="Aptos" w:hAnsi="Aptos" w:eastAsia="Aptos"/>
-          <w:b/>
-          <w:color w:val="2348E8"/>
-          <w:sz w:val="26"/>
+          <w:sz w:val="22"/>
         </w:rPr>
-        <w:t>Ver viaturas</w:t>
+        <w:t>Preencha Marca, Modelo, Ano, Matrícula, VIN, Cor, Quilometragem e Combustível.</w:t>
       </w:r>
     </w:p>
     <w:p>
       <w:pPr>
-        <w:spacing w:after="120"/>
+        <w:pStyle w:val="ListNumber"/>
       </w:pPr>
       <w:r>
         <w:rPr>
           <w:rFonts w:ascii="Aptos" w:hAnsi="Aptos" w:eastAsia="Aptos"/>
-          <w:b w:val="0"/>
-          <w:i w:val="0"/>
           <w:sz w:val="22"/>
         </w:rPr>
-        <w:t>No menu «Viaturas» encontra a lista de todas as viaturas a que tem acesso, organizada em dois separadores: «Stock» e «Viaturas de Investidores». Pode filtrar por estado no canto superior direito.</w:t>
+        <w:t>Introduza o Preço de Compra (obrigatório) e, se aplicável, o Preço de Venda.</w:t>
       </w:r>
     </w:p>
     <w:p>
       <w:pPr>
+        <w:pStyle w:val="ListNumber"/>
+      </w:pPr>
+      <w:r>
+        <w:rPr>
+          <w:rFonts w:ascii="Aptos" w:hAnsi="Aptos" w:eastAsia="Aptos"/>
+          <w:sz w:val="22"/>
+        </w:rPr>
+        <w:t>O diretor pode atribuir a viatura a um comercial e associar um investidor.</w:t>
+      </w:r>
+    </w:p>
+    <w:p>
+      <w:pPr>
+        <w:pStyle w:val="ListNumber"/>
+      </w:pPr>
+      <w:r>
+        <w:rPr>
+          <w:rFonts w:ascii="Aptos" w:hAnsi="Aptos" w:eastAsia="Aptos"/>
+          <w:sz w:val="22"/>
+        </w:rPr>
+        <w:t>Clique em «Guardar».</w:t>
+      </w:r>
+    </w:p>
+    <w:p>
+      <w:pPr>
         <w:jc w:val="center"/>
       </w:pPr>
       <w:r>
         <w:drawing>
           <wp:inline xmlns:a="http://schemas.openxmlformats.org/drawingml/2006/main" xmlns:pic="http://schemas.openxmlformats.org/drawingml/2006/picture">
-            <wp:extent cx="5486400" cy="3857625"/>
+            <wp:extent cx="5577840" cy="3900614"/>
             <wp:docPr id="5" name="Picture 5"/>
             <wp:cNvGraphicFramePr>
               <a:graphicFrameLocks noChangeAspect="1"/>
@@ -1161,7 +1248,7 @@
               <a:graphicData uri="http://schemas.openxmlformats.org/drawingml/2006/picture">
                 <pic:pic>
                   <pic:nvPicPr>
-                    <pic:cNvPr id="0" name="image4.png"/>
+                    <pic:cNvPr id="0" name="new_vehicle.png"/>
                     <pic:cNvPicPr/>
                   </pic:nvPicPr>
                   <pic:blipFill>
@@ -1173,7 +1260,7 @@
                   <pic:spPr>
                     <a:xfrm>
                       <a:off x="0" y="0"/>
-                      <a:ext cx="5486400" cy="3857625"/>
+                      <a:ext cx="5577840" cy="3900614"/>
                     </a:xfrm>
                     <a:prstGeom prst="rect"/>
                   </pic:spPr>
@@ -1196,148 +1283,7 @@
           <w:color w:val="555555"/>
           <w:sz w:val="18"/>
         </w:rPr>
-        <w:t>Figura 4: Lista de viaturas.</w:t>
-      </w:r>
-    </w:p>
-    <w:p>
-      <w:pPr>
-        <w:pStyle w:val="Heading2"/>
-        <w:spacing w:before="200" w:after="80"/>
-      </w:pPr>
-      <w:r>
-        <w:rPr>
-          <w:rFonts w:ascii="Aptos" w:hAnsi="Aptos" w:eastAsia="Aptos"/>
-          <w:b/>
-          <w:color w:val="2348E8"/>
-          <w:sz w:val="26"/>
-        </w:rPr>
-        <w:t>Registar uma nova viatura</w:t>
-      </w:r>
-    </w:p>
-    <w:p>
-      <w:pPr>
-        <w:pStyle w:val="ListNumber"/>
-      </w:pPr>
-      <w:r>
-        <w:rPr>
-          <w:rFonts w:ascii="Aptos" w:hAnsi="Aptos" w:eastAsia="Aptos"/>
-          <w:sz w:val="22"/>
-        </w:rPr>
-        <w:t>Clique no botão «+ Nova Viatura».</w:t>
-      </w:r>
-    </w:p>
-    <w:p>
-      <w:pPr>
-        <w:pStyle w:val="ListNumber"/>
-      </w:pPr>
-      <w:r>
-        <w:rPr>
-          <w:rFonts w:ascii="Aptos" w:hAnsi="Aptos" w:eastAsia="Aptos"/>
-          <w:sz w:val="22"/>
-        </w:rPr>
-        <w:t>Preencha primeiro a Data (pode usar o botão «Hoje»).</w:t>
-      </w:r>
-    </w:p>
-    <w:p>
-      <w:pPr>
-        <w:pStyle w:val="ListNumber"/>
-      </w:pPr>
-      <w:r>
-        <w:rPr>
-          <w:rFonts w:ascii="Aptos" w:hAnsi="Aptos" w:eastAsia="Aptos"/>
-          <w:sz w:val="22"/>
-        </w:rPr>
-        <w:t>Preencha Marca, Modelo, Ano, Matrícula, VIN, Cor, Quilometragem e Combustível.</w:t>
-      </w:r>
-    </w:p>
-    <w:p>
-      <w:pPr>
-        <w:pStyle w:val="ListNumber"/>
-      </w:pPr>
-      <w:r>
-        <w:rPr>
-          <w:rFonts w:ascii="Aptos" w:hAnsi="Aptos" w:eastAsia="Aptos"/>
-          <w:sz w:val="22"/>
-        </w:rPr>
-        <w:t>Introduza o Preço de Compra (obrigatório) e, se aplicável, o Preço de Venda.</w:t>
-      </w:r>
-    </w:p>
-    <w:p>
-      <w:pPr>
-        <w:pStyle w:val="ListNumber"/>
-      </w:pPr>
-      <w:r>
-        <w:rPr>
-          <w:rFonts w:ascii="Aptos" w:hAnsi="Aptos" w:eastAsia="Aptos"/>
-          <w:sz w:val="22"/>
-        </w:rPr>
-        <w:t>O diretor pode atribuir a viatura a um comercial e associar um investidor.</w:t>
-      </w:r>
-    </w:p>
-    <w:p>
-      <w:pPr>
-        <w:pStyle w:val="ListNumber"/>
-      </w:pPr>
-      <w:r>
-        <w:rPr>
-          <w:rFonts w:ascii="Aptos" w:hAnsi="Aptos" w:eastAsia="Aptos"/>
-          <w:sz w:val="22"/>
-        </w:rPr>
-        <w:t>Clique em «Guardar».</w:t>
-      </w:r>
-    </w:p>
-    <w:p>
-      <w:pPr>
-        <w:jc w:val="center"/>
-      </w:pPr>
-      <w:r>
-        <w:drawing>
-          <wp:inline xmlns:a="http://schemas.openxmlformats.org/drawingml/2006/main" xmlns:pic="http://schemas.openxmlformats.org/drawingml/2006/picture">
-            <wp:extent cx="5486400" cy="3857625"/>
-            <wp:docPr id="6" name="Picture 6"/>
-            <wp:cNvGraphicFramePr>
-              <a:graphicFrameLocks noChangeAspect="1"/>
-            </wp:cNvGraphicFramePr>
-            <a:graphic>
-              <a:graphicData uri="http://schemas.openxmlformats.org/drawingml/2006/picture">
-                <pic:pic>
-                  <pic:nvPicPr>
-                    <pic:cNvPr id="0" name="image5.png"/>
-                    <pic:cNvPicPr/>
-                  </pic:nvPicPr>
-                  <pic:blipFill>
-                    <a:blip r:embed="rId14"/>
-                    <a:stretch>
-                      <a:fillRect/>
-                    </a:stretch>
-                  </pic:blipFill>
-                  <pic:spPr>
-                    <a:xfrm>
-                      <a:off x="0" y="0"/>
-                      <a:ext cx="5486400" cy="3857625"/>
-                    </a:xfrm>
-                    <a:prstGeom prst="rect"/>
-                  </pic:spPr>
-                </pic:pic>
-              </a:graphicData>
-            </a:graphic>
-          </wp:inline>
-        </w:drawing>
-      </w:r>
-    </w:p>
-    <w:p>
-      <w:pPr>
-        <w:spacing w:after="200"/>
-        <w:jc w:val="center"/>
-      </w:pPr>
-      <w:r>
-        <w:rPr>
-          <w:rFonts w:ascii="Aptos" w:hAnsi="Aptos" w:eastAsia="Aptos"/>
-          <w:i/>
-          <w:color w:val="555555"/>
-          <w:sz w:val="18"/>
-        </w:rPr>
-        <w:t>Figura 5: Formulário de nova viatura (campo Data com botão «Hoje»).</w:t>
+        <w:t>Figura 4: Formulário de nova viatura (campo Data com botão «Hoje»).</w:t>
       </w:r>
     </w:p>
     <w:p>
@@ -1495,8 +1441,8 @@
       <w:r>
         <w:drawing>
           <wp:inline xmlns:a="http://schemas.openxmlformats.org/drawingml/2006/main" xmlns:pic="http://schemas.openxmlformats.org/drawingml/2006/picture">
-            <wp:extent cx="5486400" cy="3857625"/>
-            <wp:docPr id="7" name="Picture 7"/>
+            <wp:extent cx="5577840" cy="3486150"/>
+            <wp:docPr id="6" name="Picture 6"/>
             <wp:cNvGraphicFramePr>
               <a:graphicFrameLocks noChangeAspect="1"/>
             </wp:cNvGraphicFramePr>
@@ -1504,11 +1450,11 @@
               <a:graphicData uri="http://schemas.openxmlformats.org/drawingml/2006/picture">
                 <pic:pic>
                   <pic:nvPicPr>
-                    <pic:cNvPr id="0" name="image6.png"/>
+                    <pic:cNvPr id="0" name="vehicle_history.png"/>
                     <pic:cNvPicPr/>
                   </pic:nvPicPr>
                   <pic:blipFill>
-                    <a:blip r:embed="rId15"/>
+                    <a:blip r:embed="rId14"/>
                     <a:stretch>
                       <a:fillRect/>
                     </a:stretch>
@@ -1516,7 +1462,7 @@
                   <pic:spPr>
                     <a:xfrm>
                       <a:off x="0" y="0"/>
-                      <a:ext cx="5486400" cy="3857625"/>
+                      <a:ext cx="5577840" cy="3486150"/>
                     </a:xfrm>
                     <a:prstGeom prst="rect"/>
                   </pic:spPr>
@@ -1539,7 +1485,7 @@
           <w:color w:val="555555"/>
           <w:sz w:val="18"/>
         </w:rPr>
-        <w:t>Figura 6: Histórico de alterações expandido numa viatura.</w:t>
+        <w:t>Figura 5: Histórico de alterações expandido numa viatura.</w:t>
       </w:r>
     </w:p>
     <w:p>
@@ -1657,7 +1603,182 @@
       <w:r>
         <w:drawing>
           <wp:inline xmlns:a="http://schemas.openxmlformats.org/drawingml/2006/main" xmlns:pic="http://schemas.openxmlformats.org/drawingml/2006/picture">
-            <wp:extent cx="5486400" cy="3857625"/>
+            <wp:extent cx="5577840" cy="3486150"/>
+            <wp:docPr id="7" name="Picture 7"/>
+            <wp:cNvGraphicFramePr>
+              <a:graphicFrameLocks noChangeAspect="1"/>
+            </wp:cNvGraphicFramePr>
+            <a:graphic>
+              <a:graphicData uri="http://schemas.openxmlformats.org/drawingml/2006/picture">
+                <pic:pic>
+                  <pic:nvPicPr>
+                    <pic:cNvPr id="0" name="investors.png"/>
+                    <pic:cNvPicPr/>
+                  </pic:nvPicPr>
+                  <pic:blipFill>
+                    <a:blip r:embed="rId15"/>
+                    <a:stretch>
+                      <a:fillRect/>
+                    </a:stretch>
+                  </pic:blipFill>
+                  <pic:spPr>
+                    <a:xfrm>
+                      <a:off x="0" y="0"/>
+                      <a:ext cx="5577840" cy="3486150"/>
+                    </a:xfrm>
+                    <a:prstGeom prst="rect"/>
+                  </pic:spPr>
+                </pic:pic>
+              </a:graphicData>
+            </a:graphic>
+          </wp:inline>
+        </w:drawing>
+      </w:r>
+    </w:p>
+    <w:p>
+      <w:pPr>
+        <w:spacing w:after="200"/>
+        <w:jc w:val="center"/>
+      </w:pPr>
+      <w:r>
+        <w:rPr>
+          <w:rFonts w:ascii="Aptos" w:hAnsi="Aptos" w:eastAsia="Aptos"/>
+          <w:i/>
+          <w:color w:val="555555"/>
+          <w:sz w:val="18"/>
+        </w:rPr>
+        <w:t>Figura 6: Gestão de investidores.</w:t>
+      </w:r>
+    </w:p>
+    <w:p>
+      <w:pPr>
+        <w:pStyle w:val="Heading2"/>
+        <w:spacing w:before="200" w:after="80"/>
+      </w:pPr>
+      <w:r>
+        <w:rPr>
+          <w:rFonts w:ascii="Aptos" w:hAnsi="Aptos" w:eastAsia="Aptos"/>
+          <w:b/>
+          <w:color w:val="2348E8"/>
+          <w:sz w:val="26"/>
+        </w:rPr>
+        <w:t>Gerir investidores</w:t>
+      </w:r>
+    </w:p>
+    <w:p>
+      <w:pPr>
+        <w:pStyle w:val="ListNumber"/>
+      </w:pPr>
+      <w:r>
+        <w:rPr>
+          <w:rFonts w:ascii="Aptos" w:hAnsi="Aptos" w:eastAsia="Aptos"/>
+          <w:sz w:val="22"/>
+        </w:rPr>
+        <w:t>No «Painel», separador «Investidores», clique em «+ Novo Investidor».</w:t>
+      </w:r>
+    </w:p>
+    <w:p>
+      <w:pPr>
+        <w:pStyle w:val="ListNumber"/>
+      </w:pPr>
+      <w:r>
+        <w:rPr>
+          <w:rFonts w:ascii="Aptos" w:hAnsi="Aptos" w:eastAsia="Aptos"/>
+          <w:sz w:val="22"/>
+        </w:rPr>
+        <w:t>Registe as contribuições de capital (depósitos) de cada investidor.</w:t>
+      </w:r>
+    </w:p>
+    <w:p>
+      <w:pPr>
+        <w:pStyle w:val="ListNumber"/>
+      </w:pPr>
+      <w:r>
+        <w:rPr>
+          <w:rFonts w:ascii="Aptos" w:hAnsi="Aptos" w:eastAsia="Aptos"/>
+          <w:sz w:val="22"/>
+        </w:rPr>
+        <w:t>Associe viaturas a um investidor no registo ou edição da viatura.</w:t>
+      </w:r>
+    </w:p>
+    <w:p>
+      <w:pPr>
+        <w:pStyle w:val="ListNumber"/>
+      </w:pPr>
+      <w:r>
+        <w:rPr>
+          <w:rFonts w:ascii="Aptos" w:hAnsi="Aptos" w:eastAsia="Aptos"/>
+          <w:sz w:val="22"/>
+        </w:rPr>
+        <w:t>Pode convidar o investidor, por email, para aceder ao seu próprio portal.</w:t>
+      </w:r>
+    </w:p>
+    <w:p>
+      <w:pPr>
+        <w:pStyle w:val="Heading1"/>
+        <w:spacing w:before="280" w:after="120"/>
+      </w:pPr>
+      <w:r>
+        <w:rPr>
+          <w:rFonts w:ascii="Aptos" w:hAnsi="Aptos" w:eastAsia="Aptos"/>
+          <w:b/>
+          <w:color w:val="2348E8"/>
+          <w:sz w:val="34"/>
+        </w:rPr>
+        <w:t>9. Relatórios</w:t>
+      </w:r>
+    </w:p>
+    <w:p>
+      <w:pPr>
+        <w:spacing w:after="120"/>
+      </w:pPr>
+      <w:r>
+        <w:rPr>
+          <w:rFonts w:ascii="Aptos" w:hAnsi="Aptos" w:eastAsia="Aptos"/>
+          <w:b w:val="0"/>
+          <w:i w:val="0"/>
+          <w:sz w:val="22"/>
+        </w:rPr>
+        <w:t>(Disponível para Diretores)</w:t>
+      </w:r>
+    </w:p>
+    <w:p>
+      <w:pPr>
+        <w:pStyle w:val="Heading2"/>
+        <w:spacing w:before="200" w:after="80"/>
+      </w:pPr>
+      <w:r>
+        <w:rPr>
+          <w:rFonts w:ascii="Aptos" w:hAnsi="Aptos" w:eastAsia="Aptos"/>
+          <w:b/>
+          <w:color w:val="2348E8"/>
+          <w:sz w:val="26"/>
+        </w:rPr>
+        <w:t>Relatório de Viaturas</w:t>
+      </w:r>
+    </w:p>
+    <w:p>
+      <w:pPr>
+        <w:spacing w:after="120"/>
+      </w:pPr>
+      <w:r>
+        <w:rPr>
+          <w:rFonts w:ascii="Aptos" w:hAnsi="Aptos" w:eastAsia="Aptos"/>
+          <w:b w:val="0"/>
+          <w:i w:val="0"/>
+          <w:sz w:val="22"/>
+        </w:rPr>
+        <w:t>Mostra o desempenho por comercial e o detalhe das vendas, com margens e percentagens.</w:t>
+      </w:r>
+    </w:p>
+    <w:p>
+      <w:pPr>
+        <w:jc w:val="center"/>
+      </w:pPr>
+      <w:r>
+        <w:drawing>
+          <wp:inline xmlns:a="http://schemas.openxmlformats.org/drawingml/2006/main" xmlns:pic="http://schemas.openxmlformats.org/drawingml/2006/picture">
+            <wp:extent cx="5577840" cy="5085906"/>
             <wp:docPr id="8" name="Picture 8"/>
             <wp:cNvGraphicFramePr>
               <a:graphicFrameLocks noChangeAspect="1"/>
@@ -1666,7 +1787,7 @@
               <a:graphicData uri="http://schemas.openxmlformats.org/drawingml/2006/picture">
                 <pic:pic>
                   <pic:nvPicPr>
-                    <pic:cNvPr id="0" name="image7.png"/>
+                    <pic:cNvPr id="0" name="reports.png"/>
                     <pic:cNvPicPr/>
                   </pic:nvPicPr>
                   <pic:blipFill>
@@ -1678,7 +1799,7 @@
                   <pic:spPr>
                     <a:xfrm>
                       <a:off x="0" y="0"/>
-                      <a:ext cx="5486400" cy="3857625"/>
+                      <a:ext cx="5577840" cy="5085906"/>
                     </a:xfrm>
                     <a:prstGeom prst="rect"/>
                   </pic:spPr>
@@ -1701,7 +1822,7 @@
           <w:color w:val="555555"/>
           <w:sz w:val="18"/>
         </w:rPr>
-        <w:t>Figura 7: Gestão de investidores.</w:t>
+        <w:t>Figura 7: Relatório de viaturas.</w:t>
       </w:r>
     </w:p>
     <w:p>
@@ -1716,55 +1837,126 @@
           <w:color w:val="2348E8"/>
           <w:sz w:val="26"/>
         </w:rPr>
-        <w:t>Gerir investidores</w:t>
+        <w:t>Relatório de Investidores</w:t>
       </w:r>
     </w:p>
     <w:p>
       <w:pPr>
-        <w:pStyle w:val="ListNumber"/>
+        <w:spacing w:after="120"/>
+      </w:pPr>
+      <w:r>
+        <w:rPr>
+          <w:rFonts w:ascii="Aptos" w:hAnsi="Aptos" w:eastAsia="Aptos"/>
+          <w:b w:val="0"/>
+          <w:i w:val="0"/>
+          <w:sz w:val="22"/>
+        </w:rPr>
+        <w:t>Mostra a posição financeira de cada investidor: capital, viaturas, custos, vendas e saldo.</w:t>
+      </w:r>
+    </w:p>
+    <w:p>
+      <w:pPr>
+        <w:jc w:val="center"/>
+      </w:pPr>
+      <w:r>
+        <w:drawing>
+          <wp:inline xmlns:a="http://schemas.openxmlformats.org/drawingml/2006/main" xmlns:pic="http://schemas.openxmlformats.org/drawingml/2006/picture">
+            <wp:extent cx="5577840" cy="8909050"/>
+            <wp:docPr id="9" name="Picture 9"/>
+            <wp:cNvGraphicFramePr>
+              <a:graphicFrameLocks noChangeAspect="1"/>
+            </wp:cNvGraphicFramePr>
+            <a:graphic>
+              <a:graphicData uri="http://schemas.openxmlformats.org/drawingml/2006/picture">
+                <pic:pic>
+                  <pic:nvPicPr>
+                    <pic:cNvPr id="0" name="reports_investors.png"/>
+                    <pic:cNvPicPr/>
+                  </pic:nvPicPr>
+                  <pic:blipFill>
+                    <a:blip r:embed="rId17"/>
+                    <a:stretch>
+                      <a:fillRect/>
+                    </a:stretch>
+                  </pic:blipFill>
+                  <pic:spPr>
+                    <a:xfrm>
+                      <a:off x="0" y="0"/>
+                      <a:ext cx="5577840" cy="8909050"/>
+                    </a:xfrm>
+                    <a:prstGeom prst="rect"/>
+                  </pic:spPr>
+                </pic:pic>
+              </a:graphicData>
+            </a:graphic>
+          </wp:inline>
+        </w:drawing>
+      </w:r>
+    </w:p>
+    <w:p>
+      <w:pPr>
+        <w:spacing w:after="200"/>
+        <w:jc w:val="center"/>
+      </w:pPr>
+      <w:r>
+        <w:rPr>
+          <w:rFonts w:ascii="Aptos" w:hAnsi="Aptos" w:eastAsia="Aptos"/>
+          <w:i/>
+          <w:color w:val="555555"/>
+          <w:sz w:val="18"/>
+        </w:rPr>
+        <w:t>Figura 8: Relatório de investidores.</w:t>
+      </w:r>
+    </w:p>
+    <w:p>
+      <w:pPr>
+        <w:pStyle w:val="Heading2"/>
+        <w:spacing w:before="200" w:after="80"/>
+      </w:pPr>
+      <w:r>
+        <w:rPr>
+          <w:rFonts w:ascii="Aptos" w:hAnsi="Aptos" w:eastAsia="Aptos"/>
+          <w:b/>
+          <w:color w:val="2348E8"/>
+          <w:sz w:val="26"/>
+        </w:rPr>
+        <w:t>Funcionalidades comuns</w:t>
+      </w:r>
+    </w:p>
+    <w:p>
+      <w:pPr>
+        <w:pStyle w:val="ListBullet"/>
       </w:pPr>
       <w:r>
         <w:rPr>
           <w:rFonts w:ascii="Aptos" w:hAnsi="Aptos" w:eastAsia="Aptos"/>
           <w:sz w:val="22"/>
         </w:rPr>
-        <w:t>Aceda ao separador «Investidores» e clique em «+ Novo Investidor».</w:t>
+        <w:t>Ordenação: clique no cabeçalho de qualquer coluna para ordenar.</w:t>
       </w:r>
     </w:p>
     <w:p>
       <w:pPr>
-        <w:pStyle w:val="ListNumber"/>
+        <w:pStyle w:val="ListBullet"/>
       </w:pPr>
       <w:r>
         <w:rPr>
           <w:rFonts w:ascii="Aptos" w:hAnsi="Aptos" w:eastAsia="Aptos"/>
           <w:sz w:val="22"/>
         </w:rPr>
-        <w:t>Registe as contribuições de capital (depósitos) de cada investidor.</w:t>
+        <w:t>Filtro por datas: intervalo personalizado ou botões rápidos (último mês, 3 meses, 365 dias).</w:t>
       </w:r>
     </w:p>
     <w:p>
       <w:pPr>
-        <w:pStyle w:val="ListNumber"/>
+        <w:pStyle w:val="ListBullet"/>
       </w:pPr>
       <w:r>
         <w:rPr>
           <w:rFonts w:ascii="Aptos" w:hAnsi="Aptos" w:eastAsia="Aptos"/>
           <w:sz w:val="22"/>
         </w:rPr>
-        <w:t>Associe viaturas a um investidor no registo ou edição da viatura.</w:t>
-      </w:r>
-    </w:p>
-    <w:p>
-      <w:pPr>
-        <w:pStyle w:val="ListNumber"/>
-      </w:pPr>
-      <w:r>
-        <w:rPr>
-          <w:rFonts w:ascii="Aptos" w:hAnsi="Aptos" w:eastAsia="Aptos"/>
-          <w:sz w:val="22"/>
-        </w:rPr>
-        <w:t>Pode convidar o investidor, por email, para aceder ao seu próprio portal.</w:t>
+        <w:t>Botão «Hoje»: preenche o campo de data com a data atual.</w:t>
       </w:r>
     </w:p>
     <w:p>
@@ -1779,7 +1971,96 @@
           <w:color w:val="2348E8"/>
           <w:sz w:val="34"/>
         </w:rPr>
-        <w:t>9. Relatórios</w:t>
+        <w:t>10. Painel</w:t>
+      </w:r>
+    </w:p>
+    <w:p>
+      <w:pPr>
+        <w:spacing w:after="120"/>
+      </w:pPr>
+      <w:r>
+        <w:rPr>
+          <w:rFonts w:ascii="Aptos" w:hAnsi="Aptos" w:eastAsia="Aptos"/>
+          <w:b w:val="0"/>
+          <w:i w:val="0"/>
+          <w:sz w:val="22"/>
+        </w:rPr>
+        <w:t>O menu «Painel» reúne, num único lugar, as definições pessoais e de gestão. Os separadores disponíveis dependem do seu perfil:</w:t>
+      </w:r>
+    </w:p>
+    <w:p>
+      <w:pPr>
+        <w:pStyle w:val="ListBullet"/>
+      </w:pPr>
+      <w:r>
+        <w:rPr>
+          <w:rFonts w:ascii="Aptos" w:hAnsi="Aptos" w:eastAsia="Aptos"/>
+          <w:sz w:val="22"/>
+        </w:rPr>
+        <w:t>Perfil: os seus dados pessoais e a alteração da password (todos os utilizadores).</w:t>
+      </w:r>
+    </w:p>
+    <w:p>
+      <w:pPr>
+        <w:pStyle w:val="ListBullet"/>
+      </w:pPr>
+      <w:r>
+        <w:rPr>
+          <w:rFonts w:ascii="Aptos" w:hAnsi="Aptos" w:eastAsia="Aptos"/>
+          <w:sz w:val="22"/>
+        </w:rPr>
+        <w:t>Utilizadores: gestão da equipa (diretor).</w:t>
+      </w:r>
+    </w:p>
+    <w:p>
+      <w:pPr>
+        <w:pStyle w:val="ListBullet"/>
+      </w:pPr>
+      <w:r>
+        <w:rPr>
+          <w:rFonts w:ascii="Aptos" w:hAnsi="Aptos" w:eastAsia="Aptos"/>
+          <w:sz w:val="22"/>
+        </w:rPr>
+        <w:t>Investidores: gestão dos investidores (diretor).</w:t>
+      </w:r>
+    </w:p>
+    <w:p>
+      <w:pPr>
+        <w:pStyle w:val="ListBullet"/>
+      </w:pPr>
+      <w:r>
+        <w:rPr>
+          <w:rFonts w:ascii="Aptos" w:hAnsi="Aptos" w:eastAsia="Aptos"/>
+          <w:sz w:val="22"/>
+        </w:rPr>
+        <w:t>Empresa: nome, logótipo e palete de cores (diretor).</w:t>
+      </w:r>
+    </w:p>
+    <w:p>
+      <w:pPr>
+        <w:pStyle w:val="ListBullet"/>
+      </w:pPr>
+      <w:r>
+        <w:rPr>
+          <w:rFonts w:ascii="Aptos" w:hAnsi="Aptos" w:eastAsia="Aptos"/>
+          <w:sz w:val="22"/>
+        </w:rPr>
+        <w:t>Registo: registo de auditoria com possibilidade de anular movimentos (diretor).</w:t>
+      </w:r>
+    </w:p>
+    <w:p>
+      <w:pPr>
+        <w:pStyle w:val="Heading2"/>
+        <w:spacing w:before="200" w:after="80"/>
+      </w:pPr>
+      <w:r>
+        <w:rPr>
+          <w:rFonts w:ascii="Aptos" w:hAnsi="Aptos" w:eastAsia="Aptos"/>
+          <w:b/>
+          <w:color w:val="2348E8"/>
+          <w:sz w:val="26"/>
+        </w:rPr>
+        <w:t>Gestão de Utilizadores</w:t>
       </w:r>
     </w:p>
     <w:p>
@@ -1798,42 +2079,13 @@
     </w:p>
     <w:p>
       <w:pPr>
-        <w:pStyle w:val="Heading2"/>
-        <w:spacing w:before="200" w:after="80"/>
-      </w:pPr>
-      <w:r>
-        <w:rPr>
-          <w:rFonts w:ascii="Aptos" w:hAnsi="Aptos" w:eastAsia="Aptos"/>
-          <w:b/>
-          <w:color w:val="2348E8"/>
-          <w:sz w:val="26"/>
-        </w:rPr>
-        <w:t>Relatório de Viaturas</w:t>
-      </w:r>
-    </w:p>
-    <w:p>
-      <w:pPr>
-        <w:spacing w:after="120"/>
-      </w:pPr>
-      <w:r>
-        <w:rPr>
-          <w:rFonts w:ascii="Aptos" w:hAnsi="Aptos" w:eastAsia="Aptos"/>
-          <w:b w:val="0"/>
-          <w:i w:val="0"/>
-          <w:sz w:val="22"/>
-        </w:rPr>
-        <w:t>Mostra o desempenho por comercial e o detalhe das vendas, com margens e percentagens.</w:t>
-      </w:r>
-    </w:p>
-    <w:p>
-      <w:pPr>
         <w:jc w:val="center"/>
       </w:pPr>
       <w:r>
         <w:drawing>
           <wp:inline xmlns:a="http://schemas.openxmlformats.org/drawingml/2006/main" xmlns:pic="http://schemas.openxmlformats.org/drawingml/2006/picture">
-            <wp:extent cx="5486400" cy="3857625"/>
-            <wp:docPr id="9" name="Picture 9"/>
+            <wp:extent cx="5577840" cy="3486150"/>
+            <wp:docPr id="10" name="Picture 10"/>
             <wp:cNvGraphicFramePr>
               <a:graphicFrameLocks noChangeAspect="1"/>
             </wp:cNvGraphicFramePr>
@@ -1841,11 +2093,11 @@
               <a:graphicData uri="http://schemas.openxmlformats.org/drawingml/2006/picture">
                 <pic:pic>
                   <pic:nvPicPr>
-                    <pic:cNvPr id="0" name="image8.png"/>
+                    <pic:cNvPr id="0" name="users.png"/>
                     <pic:cNvPicPr/>
                   </pic:nvPicPr>
                   <pic:blipFill>
-                    <a:blip r:embed="rId17"/>
+                    <a:blip r:embed="rId18"/>
                     <a:stretch>
                       <a:fillRect/>
                     </a:stretch>
@@ -1853,7 +2105,7 @@
                   <pic:spPr>
                     <a:xfrm>
                       <a:off x="0" y="0"/>
-                      <a:ext cx="5486400" cy="3857625"/>
+                      <a:ext cx="5577840" cy="3486150"/>
                     </a:xfrm>
                     <a:prstGeom prst="rect"/>
                   </pic:spPr>
@@ -1876,7 +2128,7 @@
           <w:color w:val="555555"/>
           <w:sz w:val="18"/>
         </w:rPr>
-        <w:t>Figura 8: Relatório de viaturas.</w:t>
+        <w:t>Figura 9: Gestão de utilizadores.</w:t>
       </w:r>
     </w:p>
     <w:p>
@@ -1891,7 +2143,82 @@
           <w:color w:val="2348E8"/>
           <w:sz w:val="26"/>
         </w:rPr>
-        <w:t>Relatório de Investidores</w:t>
+        <w:t>Criar um utilizador</w:t>
+      </w:r>
+    </w:p>
+    <w:p>
+      <w:pPr>
+        <w:pStyle w:val="ListNumber"/>
+      </w:pPr>
+      <w:r>
+        <w:rPr>
+          <w:rFonts w:ascii="Aptos" w:hAnsi="Aptos" w:eastAsia="Aptos"/>
+          <w:sz w:val="22"/>
+        </w:rPr>
+        <w:t>No separador «Utilizadores», indique o email da pessoa e o papel pretendido.</w:t>
+      </w:r>
+    </w:p>
+    <w:p>
+      <w:pPr>
+        <w:pStyle w:val="ListNumber"/>
+      </w:pPr>
+      <w:r>
+        <w:rPr>
+          <w:rFonts w:ascii="Aptos" w:hAnsi="Aptos" w:eastAsia="Aptos"/>
+          <w:sz w:val="22"/>
+        </w:rPr>
+        <w:t>É gerada uma ligação de convite para enviar à pessoa, que a usa para se registar.</w:t>
+      </w:r>
+    </w:p>
+    <w:p>
+      <w:pPr>
+        <w:pStyle w:val="Heading2"/>
+        <w:spacing w:before="200" w:after="80"/>
+      </w:pPr>
+      <w:r>
+        <w:rPr>
+          <w:rFonts w:ascii="Aptos" w:hAnsi="Aptos" w:eastAsia="Aptos"/>
+          <w:b/>
+          <w:color w:val="2348E8"/>
+          <w:sz w:val="26"/>
+        </w:rPr>
+        <w:t>Editar, suspender ou apagar</w:t>
+      </w:r>
+    </w:p>
+    <w:p>
+      <w:pPr>
+        <w:pStyle w:val="ListBullet"/>
+      </w:pPr>
+      <w:r>
+        <w:rPr>
+          <w:rFonts w:ascii="Aptos" w:hAnsi="Aptos" w:eastAsia="Aptos"/>
+          <w:sz w:val="22"/>
+        </w:rPr>
+        <w:t>Editar: alterar nome, email, telefone e definir nova password.</w:t>
+      </w:r>
+    </w:p>
+    <w:p>
+      <w:pPr>
+        <w:pStyle w:val="ListBullet"/>
+      </w:pPr>
+      <w:r>
+        <w:rPr>
+          <w:rFonts w:ascii="Aptos" w:hAnsi="Aptos" w:eastAsia="Aptos"/>
+          <w:sz w:val="22"/>
+        </w:rPr>
+        <w:t>Suspender: bloqueia o acesso (reversível com «Reativar»).</w:t>
+      </w:r>
+    </w:p>
+    <w:p>
+      <w:pPr>
+        <w:pStyle w:val="ListBullet"/>
+      </w:pPr>
+      <w:r>
+        <w:rPr>
+          <w:rFonts w:ascii="Aptos" w:hAnsi="Aptos" w:eastAsia="Aptos"/>
+          <w:sz w:val="22"/>
+        </w:rPr>
+        <w:t>Apagar: elimina permanentemente a conta (irreversível).</w:t>
       </w:r>
     </w:p>
     <w:p>
@@ -1905,18 +2232,47 @@
           <w:i w:val="0"/>
           <w:sz w:val="22"/>
         </w:rPr>
-        <w:t>Mostra a posição financeira de cada investidor: capital, viaturas, custos, vendas e saldo.</w:t>
+        <w:t>O diretor gere os comerciais e investidores da sua equipa. Os comerciais e investidores apenas se vêem a si próprios e podem alterar a sua password.</w:t>
       </w:r>
     </w:p>
     <w:p>
       <w:pPr>
+        <w:pStyle w:val="Heading2"/>
+        <w:spacing w:before="200" w:after="80"/>
+      </w:pPr>
+      <w:r>
+        <w:rPr>
+          <w:rFonts w:ascii="Aptos" w:hAnsi="Aptos" w:eastAsia="Aptos"/>
+          <w:b/>
+          <w:color w:val="2348E8"/>
+          <w:sz w:val="26"/>
+        </w:rPr>
+        <w:t>O Meu Perfil</w:t>
+      </w:r>
+    </w:p>
+    <w:p>
+      <w:pPr>
+        <w:spacing w:after="120"/>
+      </w:pPr>
+      <w:r>
+        <w:rPr>
+          <w:rFonts w:ascii="Aptos" w:hAnsi="Aptos" w:eastAsia="Aptos"/>
+          <w:b w:val="0"/>
+          <w:i w:val="0"/>
+          <w:sz w:val="22"/>
+        </w:rPr>
+        <w:t>No separador «Perfil», todos os utilizadores podem consultar os seus dados, atualizar email e telefone e alterar a password.</w:t>
+      </w:r>
+    </w:p>
+    <w:p>
+      <w:pPr>
         <w:jc w:val="center"/>
       </w:pPr>
       <w:r>
         <w:drawing>
           <wp:inline xmlns:a="http://schemas.openxmlformats.org/drawingml/2006/main" xmlns:pic="http://schemas.openxmlformats.org/drawingml/2006/picture">
-            <wp:extent cx="5486400" cy="3857625"/>
-            <wp:docPr id="10" name="Picture 10"/>
+            <wp:extent cx="5577840" cy="3656584"/>
+            <wp:docPr id="11" name="Picture 11"/>
             <wp:cNvGraphicFramePr>
               <a:graphicFrameLocks noChangeAspect="1"/>
             </wp:cNvGraphicFramePr>
@@ -1924,11 +2280,11 @@
               <a:graphicData uri="http://schemas.openxmlformats.org/drawingml/2006/picture">
                 <pic:pic>
                   <pic:nvPicPr>
-                    <pic:cNvPr id="0" name="image9.png"/>
+                    <pic:cNvPr id="0" name="perfil.png"/>
                     <pic:cNvPicPr/>
                   </pic:nvPicPr>
                   <pic:blipFill>
-                    <a:blip r:embed="rId18"/>
+                    <a:blip r:embed="rId19"/>
                     <a:stretch>
                       <a:fillRect/>
                     </a:stretch>
@@ -1936,7 +2292,7 @@
                   <pic:spPr>
                     <a:xfrm>
                       <a:off x="0" y="0"/>
-                      <a:ext cx="5486400" cy="3857625"/>
+                      <a:ext cx="5577840" cy="3656584"/>
                     </a:xfrm>
                     <a:prstGeom prst="rect"/>
                   </pic:spPr>
@@ -1959,58 +2315,7 @@
           <w:color w:val="555555"/>
           <w:sz w:val="18"/>
         </w:rPr>
-        <w:t>Figura 9: Relatório de investidores.</w:t>
-      </w:r>
-    </w:p>
-    <w:p>
-      <w:pPr>
-        <w:pStyle w:val="Heading2"/>
-        <w:spacing w:before="200" w:after="80"/>
-      </w:pPr>
-      <w:r>
-        <w:rPr>
-          <w:rFonts w:ascii="Aptos" w:hAnsi="Aptos" w:eastAsia="Aptos"/>
-          <w:b/>
-          <w:color w:val="2348E8"/>
-          <w:sz w:val="26"/>
-        </w:rPr>
-        <w:t>Funcionalidades comuns</w:t>
-      </w:r>
-    </w:p>
-    <w:p>
-      <w:pPr>
-        <w:pStyle w:val="ListBullet"/>
-      </w:pPr>
-      <w:r>
-        <w:rPr>
-          <w:rFonts w:ascii="Aptos" w:hAnsi="Aptos" w:eastAsia="Aptos"/>
-          <w:sz w:val="22"/>
-        </w:rPr>
-        <w:t>Ordenação: clique no cabeçalho de qualquer coluna para ordenar.</w:t>
-      </w:r>
-    </w:p>
-    <w:p>
-      <w:pPr>
-        <w:pStyle w:val="ListBullet"/>
-      </w:pPr>
-      <w:r>
-        <w:rPr>
-          <w:rFonts w:ascii="Aptos" w:hAnsi="Aptos" w:eastAsia="Aptos"/>
-          <w:sz w:val="22"/>
-        </w:rPr>
-        <w:t>Filtro por datas: intervalo personalizado ou botões rápidos (último mês, 3 meses, 365 dias).</w:t>
-      </w:r>
-    </w:p>
-    <w:p>
-      <w:pPr>
-        <w:pStyle w:val="ListBullet"/>
-      </w:pPr>
-      <w:r>
-        <w:rPr>
-          <w:rFonts w:ascii="Aptos" w:hAnsi="Aptos" w:eastAsia="Aptos"/>
-          <w:sz w:val="22"/>
-        </w:rPr>
-        <w:t>Botão «Hoje»: preenche o campo de data com a data atual.</w:t>
+        <w:t>Figura 10: Página de perfil pessoal.</w:t>
       </w:r>
     </w:p>
     <w:p>
@@ -2025,96 +2330,7 @@
           <w:color w:val="2348E8"/>
           <w:sz w:val="34"/>
         </w:rPr>
-        <w:t>10. Painel</w:t>
-      </w:r>
-    </w:p>
-    <w:p>
-      <w:pPr>
-        <w:spacing w:after="120"/>
-      </w:pPr>
-      <w:r>
-        <w:rPr>
-          <w:rFonts w:ascii="Aptos" w:hAnsi="Aptos" w:eastAsia="Aptos"/>
-          <w:b w:val="0"/>
-          <w:i w:val="0"/>
-          <w:sz w:val="22"/>
-        </w:rPr>
-        <w:t>O menu «Painel» reúne, num único lugar, as definições pessoais e de gestão. Os separadores disponíveis dependem do seu perfil:</w:t>
-      </w:r>
-    </w:p>
-    <w:p>
-      <w:pPr>
-        <w:pStyle w:val="ListBullet"/>
-      </w:pPr>
-      <w:r>
-        <w:rPr>
-          <w:rFonts w:ascii="Aptos" w:hAnsi="Aptos" w:eastAsia="Aptos"/>
-          <w:sz w:val="22"/>
-        </w:rPr>
-        <w:t>Perfil: os seus dados pessoais e a alteração da password (todos os utilizadores).</w:t>
-      </w:r>
-    </w:p>
-    <w:p>
-      <w:pPr>
-        <w:pStyle w:val="ListBullet"/>
-      </w:pPr>
-      <w:r>
-        <w:rPr>
-          <w:rFonts w:ascii="Aptos" w:hAnsi="Aptos" w:eastAsia="Aptos"/>
-          <w:sz w:val="22"/>
-        </w:rPr>
-        <w:t>Utilizadores: gestão da equipa (diretor).</w:t>
-      </w:r>
-    </w:p>
-    <w:p>
-      <w:pPr>
-        <w:pStyle w:val="ListBullet"/>
-      </w:pPr>
-      <w:r>
-        <w:rPr>
-          <w:rFonts w:ascii="Aptos" w:hAnsi="Aptos" w:eastAsia="Aptos"/>
-          <w:sz w:val="22"/>
-        </w:rPr>
-        <w:t>Investidores: gestão dos investidores (diretor).</w:t>
-      </w:r>
-    </w:p>
-    <w:p>
-      <w:pPr>
-        <w:pStyle w:val="ListBullet"/>
-      </w:pPr>
-      <w:r>
-        <w:rPr>
-          <w:rFonts w:ascii="Aptos" w:hAnsi="Aptos" w:eastAsia="Aptos"/>
-          <w:sz w:val="22"/>
-        </w:rPr>
-        <w:t>Empresa: nome, logótipo e palete de cores (diretor).</w:t>
-      </w:r>
-    </w:p>
-    <w:p>
-      <w:pPr>
-        <w:pStyle w:val="ListBullet"/>
-      </w:pPr>
-      <w:r>
-        <w:rPr>
-          <w:rFonts w:ascii="Aptos" w:hAnsi="Aptos" w:eastAsia="Aptos"/>
-          <w:sz w:val="22"/>
-        </w:rPr>
-        <w:t>Registo: registo de auditoria com possibilidade de anular movimentos (diretor).</w:t>
-      </w:r>
-    </w:p>
-    <w:p>
-      <w:pPr>
-        <w:pStyle w:val="Heading2"/>
-        <w:spacing w:before="200" w:after="80"/>
-      </w:pPr>
-      <w:r>
-        <w:rPr>
-          <w:rFonts w:ascii="Aptos" w:hAnsi="Aptos" w:eastAsia="Aptos"/>
-          <w:b/>
-          <w:color w:val="2348E8"/>
-          <w:sz w:val="26"/>
-        </w:rPr>
-        <w:t>Gestão de Utilizadores</w:t>
+        <w:t>11. Personalizar a Empresa (nome, logótipo e cores)</w:t>
       </w:r>
     </w:p>
     <w:p>
@@ -2133,13 +2349,27 @@
     </w:p>
     <w:p>
       <w:pPr>
+        <w:spacing w:after="120"/>
+      </w:pPr>
+      <w:r>
+        <w:rPr>
+          <w:rFonts w:ascii="Aptos" w:hAnsi="Aptos" w:eastAsia="Aptos"/>
+          <w:b w:val="0"/>
+          <w:i w:val="0"/>
+          <w:sz w:val="22"/>
+        </w:rPr>
+        <w:t>No «Painel», separador «Empresa», o diretor define a identidade da sua empresa. Estas definições aplicam-se a toda a aplicação (menu, ecrã de início de sessão e convites).</w:t>
+      </w:r>
+    </w:p>
+    <w:p>
+      <w:pPr>
         <w:jc w:val="center"/>
       </w:pPr>
       <w:r>
         <w:drawing>
           <wp:inline xmlns:a="http://schemas.openxmlformats.org/drawingml/2006/main" xmlns:pic="http://schemas.openxmlformats.org/drawingml/2006/picture">
-            <wp:extent cx="5486400" cy="3857625"/>
-            <wp:docPr id="11" name="Picture 11"/>
+            <wp:extent cx="5577840" cy="3509391"/>
+            <wp:docPr id="12" name="Picture 12"/>
             <wp:cNvGraphicFramePr>
               <a:graphicFrameLocks noChangeAspect="1"/>
             </wp:cNvGraphicFramePr>
@@ -2147,11 +2377,11 @@
               <a:graphicData uri="http://schemas.openxmlformats.org/drawingml/2006/picture">
                 <pic:pic>
                   <pic:nvPicPr>
-                    <pic:cNvPr id="0" name="image10.png"/>
+                    <pic:cNvPr id="0" name="empresa.png"/>
                     <pic:cNvPicPr/>
                   </pic:nvPicPr>
                   <pic:blipFill>
-                    <a:blip r:embed="rId19"/>
+                    <a:blip r:embed="rId20"/>
                     <a:stretch>
                       <a:fillRect/>
                     </a:stretch>
@@ -2159,7 +2389,7 @@
                   <pic:spPr>
                     <a:xfrm>
                       <a:off x="0" y="0"/>
-                      <a:ext cx="5486400" cy="3857625"/>
+                      <a:ext cx="5577840" cy="3509391"/>
                     </a:xfrm>
                     <a:prstGeom prst="rect"/>
                   </pic:spPr>
@@ -2182,7 +2412,7 @@
           <w:color w:val="555555"/>
           <w:sz w:val="18"/>
         </w:rPr>
-        <w:t>Figura 10: Gestão de utilizadores.</w:t>
+        <w:t>Figura 11: Personalização da empresa: nome, logótipo e palete de cores.</w:t>
       </w:r>
     </w:p>
     <w:p>
@@ -2197,31 +2427,21 @@
           <w:color w:val="2348E8"/>
           <w:sz w:val="26"/>
         </w:rPr>
-        <w:t>Criar um utilizador</w:t>
+        <w:t>Nome e logótipo</w:t>
       </w:r>
     </w:p>
     <w:p>
       <w:pPr>
-        <w:pStyle w:val="ListNumber"/>
+        <w:spacing w:after="120"/>
       </w:pPr>
       <w:r>
         <w:rPr>
           <w:rFonts w:ascii="Aptos" w:hAnsi="Aptos" w:eastAsia="Aptos"/>
+          <w:b w:val="0"/>
+          <w:i w:val="0"/>
           <w:sz w:val="22"/>
         </w:rPr>
-        <w:t>No separador «Utilizadores», indique o email da pessoa e o papel pretendido.</w:t>
-      </w:r>
-    </w:p>
-    <w:p>
-      <w:pPr>
-        <w:pStyle w:val="ListNumber"/>
-      </w:pPr>
-      <w:r>
-        <w:rPr>
-          <w:rFonts w:ascii="Aptos" w:hAnsi="Aptos" w:eastAsia="Aptos"/>
-          <w:sz w:val="22"/>
-        </w:rPr>
-        <w:t>É gerada uma ligação de convite para enviar à pessoa, que a usa para se registar.</w:t>
+        <w:t>Quando uma empresa é criada, o nome e o logótipo ficam por definir. No primeiro acesso, o diretor introduz o nome e carrega o logótipo (ficheiro de imagem até 1 MB). A partir desse momento, a identidade passa a aparecer em toda a aplicação.</w:t>
       </w:r>
     </w:p>
     <w:p>
@@ -2236,43 +2456,7 @@
           <w:color w:val="2348E8"/>
           <w:sz w:val="26"/>
         </w:rPr>
-        <w:t>Editar, suspender ou apagar</w:t>
-      </w:r>
-    </w:p>
-    <w:p>
-      <w:pPr>
-        <w:pStyle w:val="ListBullet"/>
-      </w:pPr>
-      <w:r>
-        <w:rPr>
-          <w:rFonts w:ascii="Aptos" w:hAnsi="Aptos" w:eastAsia="Aptos"/>
-          <w:sz w:val="22"/>
-        </w:rPr>
-        <w:t>Editar: alterar nome, email, telefone e definir nova password.</w:t>
-      </w:r>
-    </w:p>
-    <w:p>
-      <w:pPr>
-        <w:pStyle w:val="ListBullet"/>
-      </w:pPr>
-      <w:r>
-        <w:rPr>
-          <w:rFonts w:ascii="Aptos" w:hAnsi="Aptos" w:eastAsia="Aptos"/>
-          <w:sz w:val="22"/>
-        </w:rPr>
-        <w:t>Suspender: bloqueia o acesso (reversível com «Reativar»).</w:t>
-      </w:r>
-    </w:p>
-    <w:p>
-      <w:pPr>
-        <w:pStyle w:val="ListBullet"/>
-      </w:pPr>
-      <w:r>
-        <w:rPr>
-          <w:rFonts w:ascii="Aptos" w:hAnsi="Aptos" w:eastAsia="Aptos"/>
-          <w:sz w:val="22"/>
-        </w:rPr>
-        <w:t>Apagar: elimina permanentemente a conta (irreversível).</w:t>
+        <w:t>Palete de cores</w:t>
       </w:r>
     </w:p>
     <w:p>
@@ -2286,7 +2470,7 @@
           <w:i w:val="0"/>
           <w:sz w:val="22"/>
         </w:rPr>
-        <w:t>O diretor gere os comerciais e investidores da sua equipa. Os comerciais e investidores apenas se vêem a si próprios e podem alterar a sua password.</w:t>
+        <w:t>É possível escolher a palete de cores da aplicação, entre as seguintes opções: Ouro (tons dourados sobre fundo escuro), Azuis e branco, Arco-íris (base escura com destaque colorido) e Pretos, cinzentos e brancos. Ao selecionar uma palete, a aplicação mostra logo uma pré-visualização; as cores só ficam definitivas depois de «Guardar».</w:t>
       </w:r>
     </w:p>
     <w:p>
@@ -2301,7 +2485,7 @@
           <w:color w:val="2348E8"/>
           <w:sz w:val="26"/>
         </w:rPr>
-        <w:t>O Meu Perfil</w:t>
+        <w:t>Dados de demonstração</w:t>
       </w:r>
     </w:p>
     <w:p>
@@ -2315,18 +2499,61 @@
           <w:i w:val="0"/>
           <w:sz w:val="22"/>
         </w:rPr>
-        <w:t>No separador «Perfil», todos os utilizadores podem consultar os seus dados, atualizar email e telefone e alterar a password.</w:t>
+        <w:t>Para experimentar todos os menus, o diretor pode carregar um conjunto de dados de exemplo (investidores, comerciais e viaturas) na sua empresa. Esta ação só pode ser feita uma vez e os dados ficam isolados na sua empresa.</w:t>
       </w:r>
     </w:p>
     <w:p>
       <w:pPr>
+        <w:pStyle w:val="Heading1"/>
+        <w:spacing w:before="280" w:after="120"/>
+      </w:pPr>
+      <w:r>
+        <w:rPr>
+          <w:rFonts w:ascii="Aptos" w:hAnsi="Aptos" w:eastAsia="Aptos"/>
+          <w:b/>
+          <w:color w:val="2348E8"/>
+          <w:sz w:val="34"/>
+        </w:rPr>
+        <w:t>12. Registo de Auditoria</w:t>
+      </w:r>
+    </w:p>
+    <w:p>
+      <w:pPr>
+        <w:spacing w:after="120"/>
+      </w:pPr>
+      <w:r>
+        <w:rPr>
+          <w:rFonts w:ascii="Aptos" w:hAnsi="Aptos" w:eastAsia="Aptos"/>
+          <w:b w:val="0"/>
+          <w:i w:val="0"/>
+          <w:sz w:val="22"/>
+        </w:rPr>
+        <w:t>(Disponível para Diretores)</w:t>
+      </w:r>
+    </w:p>
+    <w:p>
+      <w:pPr>
+        <w:spacing w:after="120"/>
+      </w:pPr>
+      <w:r>
+        <w:rPr>
+          <w:rFonts w:ascii="Aptos" w:hAnsi="Aptos" w:eastAsia="Aptos"/>
+          <w:b w:val="0"/>
+          <w:i w:val="0"/>
+          <w:sz w:val="22"/>
+        </w:rPr>
+        <w:t>No «Painel», separador «Registo», encontra a lista de todas as inserções, alterações e eliminações realizadas na sua empresa, com indicação de quem fez a operação e quando.</w:t>
+      </w:r>
+    </w:p>
+    <w:p>
+      <w:pPr>
         <w:jc w:val="center"/>
       </w:pPr>
       <w:r>
         <w:drawing>
           <wp:inline xmlns:a="http://schemas.openxmlformats.org/drawingml/2006/main" xmlns:pic="http://schemas.openxmlformats.org/drawingml/2006/picture">
-            <wp:extent cx="5486400" cy="3857625"/>
-            <wp:docPr id="12" name="Picture 12"/>
+            <wp:extent cx="5577840" cy="8343519"/>
+            <wp:docPr id="13" name="Picture 13"/>
             <wp:cNvGraphicFramePr>
               <a:graphicFrameLocks noChangeAspect="1"/>
             </wp:cNvGraphicFramePr>
@@ -2334,11 +2561,11 @@
               <a:graphicData uri="http://schemas.openxmlformats.org/drawingml/2006/picture">
                 <pic:pic>
                   <pic:nvPicPr>
-                    <pic:cNvPr id="0" name="image11.png"/>
+                    <pic:cNvPr id="0" name="logs.png"/>
                     <pic:cNvPicPr/>
                   </pic:nvPicPr>
                   <pic:blipFill>
-                    <a:blip r:embed="rId20"/>
+                    <a:blip r:embed="rId21"/>
                     <a:stretch>
                       <a:fillRect/>
                     </a:stretch>
@@ -2346,7 +2573,7 @@
                   <pic:spPr>
                     <a:xfrm>
                       <a:off x="0" y="0"/>
-                      <a:ext cx="5486400" cy="3857625"/>
+                      <a:ext cx="5577840" cy="8343519"/>
                     </a:xfrm>
                     <a:prstGeom prst="rect"/>
                   </pic:spPr>
@@ -2369,305 +2596,7 @@
           <w:color w:val="555555"/>
           <w:sz w:val="18"/>
         </w:rPr>
-        <w:t>Figura 11: Página de perfil pessoal.</w:t>
-      </w:r>
-    </w:p>
-    <w:p>
-      <w:pPr>
-        <w:pStyle w:val="Heading2"/>
-        <w:spacing w:before="200" w:after="80"/>
-      </w:pPr>
-      <w:r>
-        <w:rPr>
-          <w:rFonts w:ascii="Aptos" w:hAnsi="Aptos" w:eastAsia="Aptos"/>
-          <w:b/>
-          <w:color w:val="2348E8"/>
-          <w:sz w:val="26"/>
-        </w:rPr>
-        <w:t>Alterar a password</w:t>
-      </w:r>
-    </w:p>
-    <w:p>
-      <w:pPr>
-        <w:pStyle w:val="ListNumber"/>
-      </w:pPr>
-      <w:r>
-        <w:rPr>
-          <w:rFonts w:ascii="Aptos" w:hAnsi="Aptos" w:eastAsia="Aptos"/>
-          <w:sz w:val="22"/>
-        </w:rPr>
-        <w:t>Aceda ao «Painel» e ao separador «Perfil».</w:t>
-      </w:r>
-    </w:p>
-    <w:p>
-      <w:pPr>
-        <w:pStyle w:val="ListNumber"/>
-      </w:pPr>
-      <w:r>
-        <w:rPr>
-          <w:rFonts w:ascii="Aptos" w:hAnsi="Aptos" w:eastAsia="Aptos"/>
-          <w:sz w:val="22"/>
-        </w:rPr>
-        <w:t>Introduza a password atual.</w:t>
-      </w:r>
-    </w:p>
-    <w:p>
-      <w:pPr>
-        <w:pStyle w:val="ListNumber"/>
-      </w:pPr>
-      <w:r>
-        <w:rPr>
-          <w:rFonts w:ascii="Aptos" w:hAnsi="Aptos" w:eastAsia="Aptos"/>
-          <w:sz w:val="22"/>
-        </w:rPr>
-        <w:t>Introduza a nova password (mínimo 6 caracteres) e confirme-a.</w:t>
-      </w:r>
-    </w:p>
-    <w:p>
-      <w:pPr>
-        <w:pStyle w:val="ListNumber"/>
-      </w:pPr>
-      <w:r>
-        <w:rPr>
-          <w:rFonts w:ascii="Aptos" w:hAnsi="Aptos" w:eastAsia="Aptos"/>
-          <w:sz w:val="22"/>
-        </w:rPr>
-        <w:t>Clique em «Guardar Alterações».</w:t>
-      </w:r>
-    </w:p>
-    <w:p>
-      <w:pPr>
-        <w:pStyle w:val="Heading1"/>
-        <w:spacing w:before="280" w:after="120"/>
-      </w:pPr>
-      <w:r>
-        <w:rPr>
-          <w:rFonts w:ascii="Aptos" w:hAnsi="Aptos" w:eastAsia="Aptos"/>
-          <w:b/>
-          <w:color w:val="2348E8"/>
-          <w:sz w:val="34"/>
-        </w:rPr>
-        <w:t>11. Personalizar a Empresa (nome, logótipo e cores)</w:t>
-      </w:r>
-    </w:p>
-    <w:p>
-      <w:pPr>
-        <w:spacing w:after="120"/>
-      </w:pPr>
-      <w:r>
-        <w:rPr>
-          <w:rFonts w:ascii="Aptos" w:hAnsi="Aptos" w:eastAsia="Aptos"/>
-          <w:b w:val="0"/>
-          <w:i w:val="0"/>
-          <w:sz w:val="22"/>
-        </w:rPr>
-        <w:t>(Disponível para Diretores)</w:t>
-      </w:r>
-    </w:p>
-    <w:p>
-      <w:pPr>
-        <w:spacing w:after="120"/>
-      </w:pPr>
-      <w:r>
-        <w:rPr>
-          <w:rFonts w:ascii="Aptos" w:hAnsi="Aptos" w:eastAsia="Aptos"/>
-          <w:b w:val="0"/>
-          <w:i w:val="0"/>
-          <w:sz w:val="22"/>
-        </w:rPr>
-        <w:t>No «Painel», separador «Empresa», o diretor define a identidade da sua empresa. Estas definições aplicam-se a toda a aplicação (menu, ecrã de início de sessão e convites).</w:t>
-      </w:r>
-    </w:p>
-    <w:p>
-      <w:pPr>
-        <w:pStyle w:val="Heading2"/>
-        <w:spacing w:before="200" w:after="80"/>
-      </w:pPr>
-      <w:r>
-        <w:rPr>
-          <w:rFonts w:ascii="Aptos" w:hAnsi="Aptos" w:eastAsia="Aptos"/>
-          <w:b/>
-          <w:color w:val="2348E8"/>
-          <w:sz w:val="26"/>
-        </w:rPr>
-        <w:t>Nome e logótipo</w:t>
-      </w:r>
-    </w:p>
-    <w:p>
-      <w:pPr>
-        <w:spacing w:after="120"/>
-      </w:pPr>
-      <w:r>
-        <w:rPr>
-          <w:rFonts w:ascii="Aptos" w:hAnsi="Aptos" w:eastAsia="Aptos"/>
-          <w:b w:val="0"/>
-          <w:i w:val="0"/>
-          <w:sz w:val="22"/>
-        </w:rPr>
-        <w:t>Quando uma empresa é criada, o nome e o logótipo ficam por definir. No primeiro acesso, o diretor introduz o nome e carrega o logótipo (ficheiro de imagem até 1 MB). A partir desse momento, a identidade passa a aparecer em toda a aplicação.</w:t>
-      </w:r>
-    </w:p>
-    <w:p>
-      <w:pPr>
-        <w:pStyle w:val="Heading2"/>
-        <w:spacing w:before="200" w:after="80"/>
-      </w:pPr>
-      <w:r>
-        <w:rPr>
-          <w:rFonts w:ascii="Aptos" w:hAnsi="Aptos" w:eastAsia="Aptos"/>
-          <w:b/>
-          <w:color w:val="2348E8"/>
-          <w:sz w:val="26"/>
-        </w:rPr>
-        <w:t>Palete de cores</w:t>
-      </w:r>
-    </w:p>
-    <w:p>
-      <w:pPr>
-        <w:spacing w:after="120"/>
-      </w:pPr>
-      <w:r>
-        <w:rPr>
-          <w:rFonts w:ascii="Aptos" w:hAnsi="Aptos" w:eastAsia="Aptos"/>
-          <w:b w:val="0"/>
-          <w:i w:val="0"/>
-          <w:sz w:val="22"/>
-        </w:rPr>
-        <w:t>É possível escolher a palete de cores da aplicação, entre as seguintes opções:</w:t>
-      </w:r>
-    </w:p>
-    <w:p>
-      <w:pPr>
-        <w:pStyle w:val="ListBullet"/>
-      </w:pPr>
-      <w:r>
-        <w:rPr>
-          <w:rFonts w:ascii="Aptos" w:hAnsi="Aptos" w:eastAsia="Aptos"/>
-          <w:sz w:val="22"/>
-        </w:rPr>
-        <w:t>Ouro: a palete original, em tons dourados sobre fundo escuro.</w:t>
-      </w:r>
-    </w:p>
-    <w:p>
-      <w:pPr>
-        <w:pStyle w:val="ListBullet"/>
-      </w:pPr>
-      <w:r>
-        <w:rPr>
-          <w:rFonts w:ascii="Aptos" w:hAnsi="Aptos" w:eastAsia="Aptos"/>
-          <w:sz w:val="22"/>
-        </w:rPr>
-        <w:t>Azuis e branco.</w:t>
-      </w:r>
-    </w:p>
-    <w:p>
-      <w:pPr>
-        <w:pStyle w:val="ListBullet"/>
-      </w:pPr>
-      <w:r>
-        <w:rPr>
-          <w:rFonts w:ascii="Aptos" w:hAnsi="Aptos" w:eastAsia="Aptos"/>
-          <w:sz w:val="22"/>
-        </w:rPr>
-        <w:t>Arco-íris: base escura com destaque colorido.</w:t>
-      </w:r>
-    </w:p>
-    <w:p>
-      <w:pPr>
-        <w:pStyle w:val="ListBullet"/>
-      </w:pPr>
-      <w:r>
-        <w:rPr>
-          <w:rFonts w:ascii="Aptos" w:hAnsi="Aptos" w:eastAsia="Aptos"/>
-          <w:sz w:val="22"/>
-        </w:rPr>
-        <w:t>Pretos, cinzentos e brancos.</w:t>
-      </w:r>
-    </w:p>
-    <w:p>
-      <w:pPr>
-        <w:spacing w:after="120"/>
-      </w:pPr>
-      <w:r>
-        <w:rPr>
-          <w:rFonts w:ascii="Aptos" w:hAnsi="Aptos" w:eastAsia="Aptos"/>
-          <w:b w:val="0"/>
-          <w:i w:val="0"/>
-          <w:sz w:val="22"/>
-        </w:rPr>
-        <w:t>Ao selecionar uma palete, a aplicação mostra logo uma pré-visualização. As cores só ficam definitivas depois de «Guardar» e passam a ser aplicadas em todas as páginas.</w:t>
-      </w:r>
-    </w:p>
-    <w:p>
-      <w:pPr>
-        <w:pStyle w:val="Heading2"/>
-        <w:spacing w:before="200" w:after="80"/>
-      </w:pPr>
-      <w:r>
-        <w:rPr>
-          <w:rFonts w:ascii="Aptos" w:hAnsi="Aptos" w:eastAsia="Aptos"/>
-          <w:b/>
-          <w:color w:val="2348E8"/>
-          <w:sz w:val="26"/>
-        </w:rPr>
-        <w:t>Dados de demonstração</w:t>
-      </w:r>
-    </w:p>
-    <w:p>
-      <w:pPr>
-        <w:spacing w:after="120"/>
-      </w:pPr>
-      <w:r>
-        <w:rPr>
-          <w:rFonts w:ascii="Aptos" w:hAnsi="Aptos" w:eastAsia="Aptos"/>
-          <w:b w:val="0"/>
-          <w:i w:val="0"/>
-          <w:sz w:val="22"/>
-        </w:rPr>
-        <w:t>Para experimentar todos os menus, o diretor pode carregar um conjunto de dados de exemplo (investidores, comerciais e viaturas) na sua empresa. Esta ação só pode ser feita uma vez e os dados ficam isolados na sua empresa.</w:t>
-      </w:r>
-    </w:p>
-    <w:p>
-      <w:pPr>
-        <w:pStyle w:val="Heading1"/>
-        <w:spacing w:before="280" w:after="120"/>
-      </w:pPr>
-      <w:r>
-        <w:rPr>
-          <w:rFonts w:ascii="Aptos" w:hAnsi="Aptos" w:eastAsia="Aptos"/>
-          <w:b/>
-          <w:color w:val="2348E8"/>
-          <w:sz w:val="34"/>
-        </w:rPr>
-        <w:t>12. Registo de Auditoria</w:t>
-      </w:r>
-    </w:p>
-    <w:p>
-      <w:pPr>
-        <w:spacing w:after="120"/>
-      </w:pPr>
-      <w:r>
-        <w:rPr>
-          <w:rFonts w:ascii="Aptos" w:hAnsi="Aptos" w:eastAsia="Aptos"/>
-          <w:b w:val="0"/>
-          <w:i w:val="0"/>
-          <w:sz w:val="22"/>
-        </w:rPr>
-        <w:t>(Disponível para Diretores)</w:t>
-      </w:r>
-    </w:p>
-    <w:p>
-      <w:pPr>
-        <w:spacing w:after="120"/>
-      </w:pPr>
-      <w:r>
-        <w:rPr>
-          <w:rFonts w:ascii="Aptos" w:hAnsi="Aptos" w:eastAsia="Aptos"/>
-          <w:b w:val="0"/>
-          <w:i w:val="0"/>
-          <w:sz w:val="22"/>
-        </w:rPr>
-        <w:t>No «Painel», separador «Registo», encontra a lista de todas as inserções, alterações e eliminações realizadas na sua empresa, com indicação de quem fez a operação e quando.</w:t>
+        <w:t>Figura 12: Registo de auditoria da empresa.</w:t>
       </w:r>
     </w:p>
     <w:p>
@@ -2726,6 +2655,60 @@
           <w:sz w:val="22"/>
         </w:rPr>
         <w:t>O menu «Simulador» permite estimar os custos de importação de uma viatura para Portugal.</w:t>
+      </w:r>
+    </w:p>
+    <w:p>
+      <w:pPr>
+        <w:jc w:val="center"/>
+      </w:pPr>
+      <w:r>
+        <w:drawing>
+          <wp:inline xmlns:a="http://schemas.openxmlformats.org/drawingml/2006/main" xmlns:pic="http://schemas.openxmlformats.org/drawingml/2006/picture">
+            <wp:extent cx="5577840" cy="5899340"/>
+            <wp:docPr id="14" name="Picture 14"/>
+            <wp:cNvGraphicFramePr>
+              <a:graphicFrameLocks noChangeAspect="1"/>
+            </wp:cNvGraphicFramePr>
+            <a:graphic>
+              <a:graphicData uri="http://schemas.openxmlformats.org/drawingml/2006/picture">
+                <pic:pic>
+                  <pic:nvPicPr>
+                    <pic:cNvPr id="0" name="simulador.png"/>
+                    <pic:cNvPicPr/>
+                  </pic:nvPicPr>
+                  <pic:blipFill>
+                    <a:blip r:embed="rId22"/>
+                    <a:stretch>
+                      <a:fillRect/>
+                    </a:stretch>
+                  </pic:blipFill>
+                  <pic:spPr>
+                    <a:xfrm>
+                      <a:off x="0" y="0"/>
+                      <a:ext cx="5577840" cy="5899340"/>
+                    </a:xfrm>
+                    <a:prstGeom prst="rect"/>
+                  </pic:spPr>
+                </pic:pic>
+              </a:graphicData>
+            </a:graphic>
+          </wp:inline>
+        </w:drawing>
+      </w:r>
+    </w:p>
+    <w:p>
+      <w:pPr>
+        <w:spacing w:after="200"/>
+        <w:jc w:val="center"/>
+      </w:pPr>
+      <w:r>
+        <w:rPr>
+          <w:rFonts w:ascii="Aptos" w:hAnsi="Aptos" w:eastAsia="Aptos"/>
+          <w:i/>
+          <w:color w:val="555555"/>
+          <w:sz w:val="18"/>
+        </w:rPr>
+        <w:t>Figura 13: Simulador de custos de importação.</w:t>
       </w:r>
     </w:p>
     <w:p>

</xml_diff>